<commit_message>
Add real-time DOCX preview feature
Introduce an in-memory real-time DOCX preview flow: add DocumentPreviewController endpoint (/api/academic/preview/{docType}) and extend DocumentGenerationService with generatePreviewDocx and generatePreviewDocxForCopy to produce DOCX bytes without writing files (includes server-side scoring logic for docType 6). Add static assets (doc_preview.css, doc_preview.js) to render previews via docx-preview in the browser and wire preview UI into admin and applicant templates (preview button, scripts, init calls). Normalize checkmark characters in forms (from ✔️ to ✓), update various UI titles/footers, update datasource URL in application.properties, modify VSCode settings, and update several DOCX/template/upload files. Also remove legacy base.html and update doc_1.docx binary.
</commit_message>
<xml_diff>
--- a/shopping-cart-spring-boot-main/src/main/resources/templates/docx/doc_1.docx
+++ b/shopping-cart-spring-boot-main/src/main/resources/templates/docx/doc_1.docx
@@ -80,14 +80,14 @@
     </w:p>
     <w:tbl>
       <w:tblPr>
-        <w:tblStyle w:val="TableGrid"/>
+        <w:tblStyle w:val="a3"/>
         <w:tblW w:w="0" w:type="auto"/>
         <w:tblLook w:val="04A0" w:firstRow="1" w:lastRow="0" w:firstColumn="1" w:lastColumn="0" w:noHBand="0" w:noVBand="1"/>
       </w:tblPr>
       <w:tblGrid>
-        <w:gridCol w:w="698"/>
-        <w:gridCol w:w="4314"/>
-        <w:gridCol w:w="738"/>
+        <w:gridCol w:w="702"/>
+        <w:gridCol w:w="4280"/>
+        <w:gridCol w:w="768"/>
         <w:gridCol w:w="1359"/>
         <w:gridCol w:w="1265"/>
         <w:gridCol w:w="976"/>
@@ -521,7 +521,6 @@
           </w:tcPr>
           <w:p>
             <w:pPr>
-              <w:jc w:val="center"/>
               <w:rPr>
                 <w:rFonts w:ascii="TH Sarabun New" w:hAnsi="TH Sarabun New" w:cs="TH Sarabun New"/>
                 <w:sz w:val="28"/>
@@ -711,7 +710,6 @@
           </w:tcPr>
           <w:p>
             <w:pPr>
-              <w:jc w:val="center"/>
               <w:rPr>
                 <w:rFonts w:ascii="TH Sarabun New" w:hAnsi="TH Sarabun New" w:cs="TH Sarabun New"/>
                 <w:sz w:val="28"/>
@@ -929,7 +927,6 @@
           </w:tcPr>
           <w:p>
             <w:pPr>
-              <w:jc w:val="center"/>
               <w:rPr>
                 <w:rFonts w:ascii="TH Sarabun New" w:hAnsi="TH Sarabun New" w:cs="TH Sarabun New"/>
                 <w:sz w:val="28"/>
@@ -1157,7 +1154,6 @@
           </w:tcPr>
           <w:p>
             <w:pPr>
-              <w:jc w:val="center"/>
               <w:rPr>
                 <w:rFonts w:ascii="TH Sarabun New" w:hAnsi="TH Sarabun New" w:cs="TH Sarabun New"/>
                 <w:sz w:val="28"/>
@@ -1365,7 +1361,6 @@
           </w:tcPr>
           <w:p>
             <w:pPr>
-              <w:jc w:val="center"/>
               <w:rPr>
                 <w:rFonts w:ascii="TH Sarabun New" w:hAnsi="TH Sarabun New" w:cs="TH Sarabun New"/>
                 <w:sz w:val="28"/>
@@ -1407,7 +1402,6 @@
     <w:p>
       <w:pPr>
         <w:spacing w:after="0"/>
-        <w:ind w:left="720" w:firstLine="720"/>
         <w:rPr>
           <w:rFonts w:ascii="TH Sarabun New" w:hAnsi="TH Sarabun New" w:cs="TH Sarabun New"/>
           <w:b/>
@@ -1421,7 +1415,6 @@
     <w:p>
       <w:pPr>
         <w:spacing w:after="0"/>
-        <w:ind w:left="720" w:firstLine="720"/>
         <w:rPr>
           <w:rFonts w:ascii="TH Sarabun New" w:hAnsi="TH Sarabun New" w:cs="TH Sarabun New"/>
           <w:b/>
@@ -1435,255 +1428,217 @@
     <w:p>
       <w:pPr>
         <w:spacing w:after="0"/>
-        <w:ind w:left="720" w:firstLine="720"/>
         <w:rPr>
           <w:rFonts w:ascii="TH Sarabun New" w:hAnsi="TH Sarabun New" w:cs="TH Sarabun New"/>
+          <w:b/>
+          <w:bCs/>
           <w:sz w:val="32"/>
           <w:szCs w:val="32"/>
           <w:lang w:bidi="th-TH"/>
         </w:rPr>
       </w:pPr>
-      <w:r>
-        <w:rPr>
-          <w:rFonts w:ascii="TH Sarabun New" w:hAnsi="TH Sarabun New" w:cs="TH Sarabun New" w:hint="cs"/>
-          <w:sz w:val="32"/>
-          <w:szCs w:val="32"/>
-          <w:cs/>
-          <w:lang w:bidi="th-TH"/>
-        </w:rPr>
-        <w:t xml:space="preserve">   </w:t>
-      </w:r>
-      <w:r>
-        <w:rPr>
-          <w:rFonts w:ascii="TH Sarabun New" w:hAnsi="TH Sarabun New" w:cs="TH Sarabun New"/>
-          <w:sz w:val="32"/>
-          <w:szCs w:val="32"/>
-          <w:lang w:bidi="th-TH"/>
-        </w:rPr>
-        <w:t xml:space="preserve"> </w:t>
-      </w:r>
-      <w:r>
-        <w:rPr>
-          <w:rFonts w:ascii="TH Sarabun New" w:hAnsi="TH Sarabun New" w:cs="TH Sarabun New" w:hint="cs"/>
-          <w:sz w:val="32"/>
-          <w:szCs w:val="32"/>
-          <w:cs/>
-          <w:lang w:bidi="th-TH"/>
-        </w:rPr>
-        <w:t xml:space="preserve"> </w:t>
-      </w:r>
-      <w:r>
-        <w:rPr>
-          <w:rFonts w:ascii="TH Sarabun New" w:hAnsi="TH Sarabun New" w:cs="TH Sarabun New" w:hint="cs"/>
-          <w:sz w:val="32"/>
-          <w:szCs w:val="32"/>
-          <w:cs/>
-          <w:lang w:bidi="th-TH"/>
-        </w:rPr>
-        <w:t>(</w:t>
-      </w:r>
-      <w:r>
-        <w:rPr>
-          <w:rFonts w:ascii="TH Sarabun New" w:hAnsi="TH Sarabun New" w:cs="TH Sarabun New"/>
-          <w:sz w:val="32"/>
-          <w:szCs w:val="32"/>
-          <w:lang w:bidi="th-TH"/>
-        </w:rPr>
-        <w:t>{{</w:t>
-      </w:r>
-      <w:proofErr w:type="spellStart"/>
-      <w:r>
-        <w:rPr>
-          <w:rFonts w:ascii="TH Sarabun New" w:hAnsi="TH Sarabun New" w:cs="TH Sarabun New"/>
-          <w:sz w:val="32"/>
-          <w:szCs w:val="32"/>
-          <w:lang w:bidi="th-TH"/>
-        </w:rPr>
-        <w:t>name_applicant</w:t>
-      </w:r>
-      <w:proofErr w:type="spellEnd"/>
-      <w:r>
-        <w:rPr>
-          <w:rFonts w:ascii="TH Sarabun New" w:hAnsi="TH Sarabun New" w:cs="TH Sarabun New"/>
-          <w:sz w:val="32"/>
-          <w:szCs w:val="32"/>
-          <w:lang w:bidi="th-TH"/>
-        </w:rPr>
-        <w:t>}}</w:t>
-      </w:r>
-      <w:r>
-        <w:rPr>
-          <w:rFonts w:ascii="TH Sarabun New" w:hAnsi="TH Sarabun New" w:cs="TH Sarabun New" w:hint="cs"/>
-          <w:sz w:val="32"/>
-          <w:szCs w:val="32"/>
-          <w:cs/>
-          <w:lang w:bidi="th-TH"/>
-        </w:rPr>
-        <w:t>)</w:t>
-      </w:r>
-      <w:r>
-        <w:rPr>
-          <w:rFonts w:ascii="TH Sarabun New" w:hAnsi="TH Sarabun New" w:cs="TH Sarabun New"/>
-          <w:sz w:val="32"/>
-          <w:szCs w:val="32"/>
-          <w:cs/>
-          <w:lang w:bidi="th-TH"/>
-        </w:rPr>
-        <w:tab/>
-      </w:r>
-      <w:r>
-        <w:rPr>
-          <w:rFonts w:ascii="TH Sarabun New" w:hAnsi="TH Sarabun New" w:cs="TH Sarabun New"/>
-          <w:sz w:val="32"/>
-          <w:szCs w:val="32"/>
-          <w:cs/>
-          <w:lang w:bidi="th-TH"/>
-        </w:rPr>
-        <w:tab/>
-      </w:r>
-      <w:r>
-        <w:rPr>
-          <w:rFonts w:ascii="TH Sarabun New" w:hAnsi="TH Sarabun New" w:cs="TH Sarabun New"/>
-          <w:sz w:val="32"/>
-          <w:szCs w:val="32"/>
-          <w:cs/>
-          <w:lang w:bidi="th-TH"/>
-        </w:rPr>
-        <w:tab/>
-      </w:r>
-      <w:r>
-        <w:rPr>
-          <w:rFonts w:ascii="TH Sarabun New" w:hAnsi="TH Sarabun New" w:cs="TH Sarabun New"/>
-          <w:sz w:val="32"/>
-          <w:szCs w:val="32"/>
-          <w:cs/>
-          <w:lang w:bidi="th-TH"/>
-        </w:rPr>
-        <w:tab/>
-      </w:r>
-      <w:r>
-        <w:rPr>
-          <w:rFonts w:ascii="TH Sarabun New" w:hAnsi="TH Sarabun New" w:cs="TH Sarabun New" w:hint="cs"/>
-          <w:sz w:val="32"/>
-          <w:szCs w:val="32"/>
-          <w:cs/>
-          <w:lang w:bidi="th-TH"/>
-        </w:rPr>
-        <w:t>(นางสาวจิราภรณ์  หอมอ่อน)</w:t>
-      </w:r>
     </w:p>
-    <w:p>
-      <w:pPr>
-        <w:spacing w:after="0"/>
-        <w:ind w:left="720" w:firstLine="720"/>
-        <w:rPr>
-          <w:rFonts w:ascii="TH Sarabun New" w:hAnsi="TH Sarabun New" w:cs="TH Sarabun New"/>
-          <w:sz w:val="32"/>
-          <w:szCs w:val="32"/>
-          <w:lang w:bidi="th-TH"/>
-        </w:rPr>
-      </w:pPr>
-      <w:r>
-        <w:rPr>
-          <w:rFonts w:ascii="TH Sarabun New" w:hAnsi="TH Sarabun New" w:cs="TH Sarabun New" w:hint="cs"/>
-          <w:sz w:val="32"/>
-          <w:szCs w:val="32"/>
-          <w:cs/>
-          <w:lang w:bidi="th-TH"/>
-        </w:rPr>
-        <w:t xml:space="preserve"> </w:t>
-      </w:r>
-      <w:r>
-        <w:rPr>
-          <w:rFonts w:ascii="TH Sarabun New" w:hAnsi="TH Sarabun New" w:cs="TH Sarabun New" w:hint="cs"/>
-          <w:sz w:val="32"/>
-          <w:szCs w:val="32"/>
-          <w:cs/>
-          <w:lang w:bidi="th-TH"/>
-        </w:rPr>
-        <w:t>ผู้ขอ</w:t>
-      </w:r>
-      <w:r>
-        <w:rPr>
-          <w:rFonts w:ascii="TH Sarabun New" w:hAnsi="TH Sarabun New" w:cs="TH Sarabun New" w:hint="cs"/>
-          <w:sz w:val="32"/>
-          <w:szCs w:val="32"/>
-          <w:cs/>
-          <w:lang w:bidi="th-TH"/>
-        </w:rPr>
-        <w:t>รับการ</w:t>
-      </w:r>
-      <w:r>
-        <w:rPr>
-          <w:rFonts w:ascii="TH Sarabun New" w:hAnsi="TH Sarabun New" w:cs="TH Sarabun New" w:hint="cs"/>
-          <w:sz w:val="32"/>
-          <w:szCs w:val="32"/>
-          <w:cs/>
-          <w:lang w:bidi="th-TH"/>
-        </w:rPr>
-        <w:t>ประเมินผลการสอน</w:t>
-      </w:r>
-      <w:r>
-        <w:rPr>
-          <w:rFonts w:ascii="TH Sarabun New" w:hAnsi="TH Sarabun New" w:cs="TH Sarabun New"/>
-          <w:sz w:val="32"/>
-          <w:szCs w:val="32"/>
-          <w:cs/>
-          <w:lang w:bidi="th-TH"/>
-        </w:rPr>
-        <w:tab/>
-      </w:r>
-      <w:r>
-        <w:rPr>
-          <w:rFonts w:ascii="TH Sarabun New" w:hAnsi="TH Sarabun New" w:cs="TH Sarabun New"/>
-          <w:sz w:val="32"/>
-          <w:szCs w:val="32"/>
-          <w:cs/>
-          <w:lang w:bidi="th-TH"/>
-        </w:rPr>
-        <w:tab/>
-      </w:r>
-      <w:r>
-        <w:rPr>
-          <w:rFonts w:ascii="TH Sarabun New" w:hAnsi="TH Sarabun New" w:cs="TH Sarabun New"/>
-          <w:sz w:val="32"/>
-          <w:szCs w:val="32"/>
-          <w:cs/>
-          <w:lang w:bidi="th-TH"/>
-        </w:rPr>
-        <w:tab/>
-      </w:r>
-      <w:r>
-        <w:rPr>
-          <w:rFonts w:ascii="TH Sarabun New" w:hAnsi="TH Sarabun New" w:cs="TH Sarabun New"/>
-          <w:sz w:val="32"/>
-          <w:szCs w:val="32"/>
-          <w:cs/>
-          <w:lang w:bidi="th-TH"/>
-        </w:rPr>
-        <w:tab/>
-      </w:r>
-      <w:r>
-        <w:rPr>
-          <w:rFonts w:ascii="TH Sarabun New" w:hAnsi="TH Sarabun New" w:cs="TH Sarabun New" w:hint="cs"/>
-          <w:sz w:val="32"/>
-          <w:szCs w:val="32"/>
-          <w:cs/>
-          <w:lang w:bidi="th-TH"/>
-        </w:rPr>
-        <w:t xml:space="preserve">       </w:t>
-      </w:r>
-      <w:r>
-        <w:rPr>
-          <w:rFonts w:ascii="TH Sarabun New" w:hAnsi="TH Sarabun New" w:cs="TH Sarabun New" w:hint="cs"/>
-          <w:sz w:val="32"/>
-          <w:szCs w:val="32"/>
-          <w:cs/>
-          <w:lang w:bidi="th-TH"/>
-        </w:rPr>
-        <w:t xml:space="preserve">นักทรัพยากรบุคคล </w:t>
-      </w:r>
-    </w:p>
+    <w:tbl>
+      <w:tblPr>
+        <w:tblStyle w:val="a3"/>
+        <w:tblW w:w="0" w:type="auto"/>
+        <w:jc w:val="center"/>
+        <w:tblBorders>
+          <w:top w:val="none" w:sz="0" w:space="0" w:color="auto"/>
+          <w:left w:val="none" w:sz="0" w:space="0" w:color="auto"/>
+          <w:bottom w:val="none" w:sz="0" w:space="0" w:color="auto"/>
+          <w:right w:val="none" w:sz="0" w:space="0" w:color="auto"/>
+          <w:insideH w:val="none" w:sz="0" w:space="0" w:color="auto"/>
+          <w:insideV w:val="none" w:sz="0" w:space="0" w:color="auto"/>
+        </w:tblBorders>
+        <w:tblLook w:val="04A0" w:firstRow="1" w:lastRow="0" w:firstColumn="1" w:lastColumn="0" w:noHBand="0" w:noVBand="1"/>
+      </w:tblPr>
+      <w:tblGrid>
+        <w:gridCol w:w="4962"/>
+        <w:gridCol w:w="4393"/>
+      </w:tblGrid>
+      <w:tr>
+        <w:trPr>
+          <w:jc w:val="center"/>
+        </w:trPr>
+        <w:tc>
+          <w:tcPr>
+            <w:tcW w:w="4962" w:type="dxa"/>
+          </w:tcPr>
+          <w:p>
+            <w:pPr>
+              <w:jc w:val="center"/>
+              <w:rPr>
+                <w:rFonts w:ascii="TH Sarabun New" w:hAnsi="TH Sarabun New" w:cs="TH Sarabun New"/>
+                <w:b/>
+                <w:bCs/>
+                <w:sz w:val="32"/>
+                <w:szCs w:val="32"/>
+                <w:lang w:bidi="th-TH"/>
+              </w:rPr>
+            </w:pPr>
+            <w:r>
+              <w:rPr>
+                <w:rFonts w:ascii="TH Sarabun New" w:hAnsi="TH Sarabun New" w:cs="TH Sarabun New" w:hint="cs"/>
+                <w:sz w:val="32"/>
+                <w:szCs w:val="32"/>
+                <w:cs/>
+                <w:lang w:bidi="th-TH"/>
+              </w:rPr>
+              <w:t>(</w:t>
+            </w:r>
+            <w:r>
+              <w:rPr>
+                <w:rFonts w:ascii="TH Sarabun New" w:hAnsi="TH Sarabun New" w:cs="TH Sarabun New"/>
+                <w:sz w:val="32"/>
+                <w:szCs w:val="32"/>
+                <w:lang w:bidi="th-TH"/>
+              </w:rPr>
+              <w:t>{{</w:t>
+            </w:r>
+            <w:proofErr w:type="spellStart"/>
+            <w:r>
+              <w:rPr>
+                <w:rFonts w:ascii="TH Sarabun New" w:hAnsi="TH Sarabun New" w:cs="TH Sarabun New"/>
+                <w:sz w:val="32"/>
+                <w:szCs w:val="32"/>
+                <w:lang w:bidi="th-TH"/>
+              </w:rPr>
+              <w:t>name_applicant</w:t>
+            </w:r>
+            <w:proofErr w:type="spellEnd"/>
+            <w:r>
+              <w:rPr>
+                <w:rFonts w:ascii="TH Sarabun New" w:hAnsi="TH Sarabun New" w:cs="TH Sarabun New"/>
+                <w:sz w:val="32"/>
+                <w:szCs w:val="32"/>
+                <w:lang w:bidi="th-TH"/>
+              </w:rPr>
+              <w:t>}}</w:t>
+            </w:r>
+            <w:r>
+              <w:rPr>
+                <w:rFonts w:ascii="TH Sarabun New" w:hAnsi="TH Sarabun New" w:cs="TH Sarabun New" w:hint="cs"/>
+                <w:sz w:val="32"/>
+                <w:szCs w:val="32"/>
+                <w:cs/>
+                <w:lang w:bidi="th-TH"/>
+              </w:rPr>
+              <w:t>)</w:t>
+            </w:r>
+          </w:p>
+        </w:tc>
+        <w:tc>
+          <w:tcPr>
+            <w:tcW w:w="4393" w:type="dxa"/>
+          </w:tcPr>
+          <w:p>
+            <w:pPr>
+              <w:jc w:val="center"/>
+              <w:rPr>
+                <w:rFonts w:ascii="TH Sarabun New" w:hAnsi="TH Sarabun New" w:cs="TH Sarabun New"/>
+                <w:b/>
+                <w:bCs/>
+                <w:sz w:val="32"/>
+                <w:szCs w:val="32"/>
+                <w:lang w:bidi="th-TH"/>
+              </w:rPr>
+            </w:pPr>
+            <w:r>
+              <w:rPr>
+                <w:rFonts w:ascii="TH Sarabun New" w:hAnsi="TH Sarabun New" w:cs="TH Sarabun New" w:hint="cs"/>
+                <w:sz w:val="32"/>
+                <w:szCs w:val="32"/>
+                <w:cs/>
+                <w:lang w:bidi="th-TH"/>
+              </w:rPr>
+              <w:t>(นางสาวจิราภรณ์  หอมอ่อน)</w:t>
+            </w:r>
+          </w:p>
+        </w:tc>
+      </w:tr>
+      <w:tr>
+        <w:trPr>
+          <w:jc w:val="center"/>
+        </w:trPr>
+        <w:tc>
+          <w:tcPr>
+            <w:tcW w:w="4962" w:type="dxa"/>
+          </w:tcPr>
+          <w:p>
+            <w:pPr>
+              <w:jc w:val="center"/>
+              <w:rPr>
+                <w:rFonts w:ascii="TH Sarabun New" w:hAnsi="TH Sarabun New" w:cs="TH Sarabun New"/>
+                <w:b/>
+                <w:bCs/>
+                <w:sz w:val="32"/>
+                <w:szCs w:val="32"/>
+                <w:lang w:bidi="th-TH"/>
+              </w:rPr>
+            </w:pPr>
+            <w:r>
+              <w:rPr>
+                <w:rFonts w:ascii="TH Sarabun New" w:hAnsi="TH Sarabun New" w:cs="TH Sarabun New" w:hint="cs"/>
+                <w:sz w:val="32"/>
+                <w:szCs w:val="32"/>
+                <w:cs/>
+                <w:lang w:bidi="th-TH"/>
+              </w:rPr>
+              <w:t>ผู้ขอ</w:t>
+            </w:r>
+            <w:r>
+              <w:rPr>
+                <w:rFonts w:ascii="TH Sarabun New" w:hAnsi="TH Sarabun New" w:cs="TH Sarabun New" w:hint="cs"/>
+                <w:sz w:val="32"/>
+                <w:szCs w:val="32"/>
+                <w:cs/>
+                <w:lang w:bidi="th-TH"/>
+              </w:rPr>
+              <w:t>รับการ</w:t>
+            </w:r>
+            <w:r>
+              <w:rPr>
+                <w:rFonts w:ascii="TH Sarabun New" w:hAnsi="TH Sarabun New" w:cs="TH Sarabun New" w:hint="cs"/>
+                <w:sz w:val="32"/>
+                <w:szCs w:val="32"/>
+                <w:cs/>
+                <w:lang w:bidi="th-TH"/>
+              </w:rPr>
+              <w:t>ประเมินผลการสอน</w:t>
+            </w:r>
+          </w:p>
+        </w:tc>
+        <w:tc>
+          <w:tcPr>
+            <w:tcW w:w="4393" w:type="dxa"/>
+          </w:tcPr>
+          <w:p>
+            <w:pPr>
+              <w:jc w:val="center"/>
+              <w:rPr>
+                <w:rFonts w:ascii="TH Sarabun New" w:hAnsi="TH Sarabun New" w:cs="TH Sarabun New"/>
+                <w:b/>
+                <w:bCs/>
+                <w:sz w:val="32"/>
+                <w:szCs w:val="32"/>
+                <w:lang w:bidi="th-TH"/>
+              </w:rPr>
+            </w:pPr>
+            <w:r>
+              <w:rPr>
+                <w:rFonts w:ascii="TH Sarabun New" w:hAnsi="TH Sarabun New" w:cs="TH Sarabun New" w:hint="cs"/>
+                <w:sz w:val="32"/>
+                <w:szCs w:val="32"/>
+                <w:cs/>
+                <w:lang w:bidi="th-TH"/>
+              </w:rPr>
+              <w:t>นักทรัพยากรบุคคล</w:t>
+            </w:r>
+          </w:p>
+        </w:tc>
+      </w:tr>
+    </w:tbl>
     <w:p>
       <w:pPr>
         <w:rPr>
@@ -2099,17 +2054,17 @@
     <w:lsdException w:name="Unresolved Mention" w:semiHidden="1" w:unhideWhenUsed="1"/>
     <w:lsdException w:name="Smart Link" w:semiHidden="1" w:unhideWhenUsed="1"/>
   </w:latentStyles>
-  <w:style w:type="paragraph" w:default="1" w:styleId="Normal">
+  <w:style w:type="paragraph" w:default="1" w:styleId="a">
     <w:name w:val="Normal"/>
     <w:qFormat/>
   </w:style>
-  <w:style w:type="character" w:default="1" w:styleId="DefaultParagraphFont">
+  <w:style w:type="character" w:default="1" w:styleId="a0">
     <w:name w:val="Default Paragraph Font"/>
     <w:uiPriority w:val="1"/>
     <w:semiHidden/>
     <w:unhideWhenUsed/>
   </w:style>
-  <w:style w:type="table" w:default="1" w:styleId="TableNormal">
+  <w:style w:type="table" w:default="1" w:styleId="a1">
     <w:name w:val="Normal Table"/>
     <w:uiPriority w:val="99"/>
     <w:semiHidden/>
@@ -2124,15 +2079,15 @@
       </w:tblCellMar>
     </w:tblPr>
   </w:style>
-  <w:style w:type="numbering" w:default="1" w:styleId="NoList">
+  <w:style w:type="numbering" w:default="1" w:styleId="a2">
     <w:name w:val="No List"/>
     <w:uiPriority w:val="99"/>
     <w:semiHidden/>
     <w:unhideWhenUsed/>
   </w:style>
-  <w:style w:type="table" w:styleId="TableGrid">
+  <w:style w:type="table" w:styleId="a3">
     <w:name w:val="Table Grid"/>
-    <w:basedOn w:val="TableNormal"/>
+    <w:basedOn w:val="a1"/>
     <w:uiPriority w:val="39"/>
     <w:rsid w:val="002B4E33"/>
     <w:pPr>

</xml_diff>